<commit_message>
Add knowledge base context to chatbot
</commit_message>
<xml_diff>
--- a/data/news/01.docx
+++ b/data/news/01.docx
@@ -17,33 +17,41 @@
           <w:sz w:val="28"/>
           <w:szCs w:val="28"/>
         </w:rPr>
-        <w:t>#Loaivb: Hướng dẫn</w:t>
-      </w:r>
-    </w:p>
-    <w:p>
-      <w:pPr>
-        <w:spacing w:after="120" w:line="240" w:lineRule="auto"/>
-        <w:rPr>
-          <w:rFonts w:ascii="Times New Roman" w:hAnsi="Times New Roman" w:cs="Times New Roman"/>
-          <w:sz w:val="28"/>
-          <w:szCs w:val="28"/>
-        </w:rPr>
-      </w:pPr>
-      <w:r>
-        <w:rPr>
-          <w:rFonts w:ascii="Times New Roman" w:hAnsi="Times New Roman" w:cs="Times New Roman"/>
-          <w:sz w:val="28"/>
-          <w:szCs w:val="28"/>
-        </w:rPr>
-        <w:t>#Tieude: Hướng dẫn công tác sơ tuyển năm 2026</w:t>
-      </w:r>
-      <w:r>
-        <w:rPr>
-          <w:rFonts w:ascii="Times New Roman" w:hAnsi="Times New Roman" w:cs="Times New Roman"/>
-          <w:sz w:val="28"/>
-          <w:szCs w:val="28"/>
-        </w:rPr>
-        <w:t xml:space="preserve"> hihi</w:t>
+        <w:t xml:space="preserve">#Loaivb: </w:t>
+      </w:r>
+      <w:r>
+        <w:rPr>
+          <w:rFonts w:ascii="Times New Roman" w:hAnsi="Times New Roman" w:cs="Times New Roman"/>
+          <w:sz w:val="28"/>
+          <w:szCs w:val="28"/>
+        </w:rPr>
+        <w:t>Kế hoạch</w:t>
+      </w:r>
+    </w:p>
+    <w:p>
+      <w:pPr>
+        <w:spacing w:after="120" w:line="240" w:lineRule="auto"/>
+        <w:rPr>
+          <w:rFonts w:ascii="Times New Roman" w:hAnsi="Times New Roman" w:cs="Times New Roman"/>
+          <w:sz w:val="28"/>
+          <w:szCs w:val="28"/>
+        </w:rPr>
+      </w:pPr>
+      <w:r>
+        <w:rPr>
+          <w:rFonts w:ascii="Times New Roman" w:hAnsi="Times New Roman" w:cs="Times New Roman"/>
+          <w:sz w:val="28"/>
+          <w:szCs w:val="28"/>
+        </w:rPr>
+        <w:t xml:space="preserve">#Tieude: </w:t>
+      </w:r>
+      <w:r>
+        <w:rPr>
+          <w:rFonts w:ascii="Times New Roman" w:hAnsi="Times New Roman" w:cs="Times New Roman"/>
+          <w:sz w:val="28"/>
+          <w:szCs w:val="28"/>
+        </w:rPr>
+        <w:t>Kế hoạch tuyển sinh đại học chính quy tuyển mới đối với công dân đã có bằng tốt nghiệp trình độ đại học trở lên tại Học viện CSND, năm học 2025-2026 (Văn bằng 2 tuyển mới năm 2025)</w:t>
       </w:r>
     </w:p>
     <w:p>
@@ -71,83 +79,6 @@
         </w:rPr>
         <w:t xml:space="preserve"> của cái HVCS</w:t>
       </w:r>
-    </w:p>
-    <w:p>
-      <w:pPr>
-        <w:spacing w:after="120" w:line="240" w:lineRule="auto"/>
-        <w:rPr>
-          <w:rFonts w:ascii="Times New Roman" w:hAnsi="Times New Roman" w:cs="Times New Roman"/>
-          <w:sz w:val="28"/>
-          <w:szCs w:val="28"/>
-        </w:rPr>
-      </w:pPr>
-      <w:r>
-        <w:rPr>
-          <w:rFonts w:ascii="Times New Roman" w:hAnsi="Times New Roman" w:cs="Times New Roman"/>
-          <w:sz w:val="28"/>
-          <w:szCs w:val="28"/>
-        </w:rPr>
-        <w:t>Kế hoạch tuyển sinh đại học chính quy tuyển mới đối với công dân đã có bằng tốt nghiệp trình độ đại học trở lên tại Học viện CSND, năm học 2025-2026 (Văn bằng 2 tuyển mới năm 2025)</w:t>
-      </w:r>
-    </w:p>
-    <w:p>
-      <w:pPr>
-        <w:spacing w:after="120" w:line="240" w:lineRule="auto"/>
-        <w:rPr>
-          <w:rFonts w:ascii="Times New Roman" w:hAnsi="Times New Roman" w:cs="Times New Roman"/>
-          <w:sz w:val="28"/>
-          <w:szCs w:val="28"/>
-        </w:rPr>
-      </w:pPr>
-      <w:r>
-        <w:rPr>
-          <w:rFonts w:ascii="Times New Roman" w:hAnsi="Times New Roman" w:cs="Times New Roman"/>
-          <w:sz w:val="28"/>
-          <w:szCs w:val="28"/>
-        </w:rPr>
-        <w:t>Đăng vào </w:t>
-      </w:r>
-      <w:hyperlink r:id="rId5" w:history="1">
-        <w:r>
-          <w:rPr>
-            <w:rStyle w:val="Hyperlink"/>
-            <w:rFonts w:ascii="Times New Roman" w:hAnsi="Times New Roman" w:cs="Times New Roman"/>
-            <w:sz w:val="28"/>
-            <w:szCs w:val="28"/>
-          </w:rPr>
-          <w:t>16 Tháng 4, 2025</w:t>
-        </w:r>
-      </w:hyperlink>
-      <w:r>
-        <w:rPr>
-          <w:rFonts w:ascii="Times New Roman" w:hAnsi="Times New Roman" w:cs="Times New Roman"/>
-          <w:sz w:val="28"/>
-          <w:szCs w:val="28"/>
-        </w:rPr>
-        <w:t>Tác giả </w:t>
-      </w:r>
-      <w:hyperlink r:id="rId6" w:history="1">
-        <w:r>
-          <w:rPr>
-            <w:rStyle w:val="Hyperlink"/>
-            <w:rFonts w:ascii="Times New Roman" w:hAnsi="Times New Roman" w:cs="Times New Roman"/>
-            <w:sz w:val="28"/>
-            <w:szCs w:val="28"/>
-          </w:rPr>
-          <w:t>admin</w:t>
-        </w:r>
-      </w:hyperlink>
-      <w:hyperlink r:id="rId7" w:anchor="respond" w:history="1">
-        <w:r>
-          <w:rPr>
-            <w:rStyle w:val="Hyperlink"/>
-            <w:rFonts w:ascii="Times New Roman" w:hAnsi="Times New Roman" w:cs="Times New Roman"/>
-            <w:sz w:val="28"/>
-            <w:szCs w:val="28"/>
-          </w:rPr>
-          <w:t> 0</w:t>
-        </w:r>
-      </w:hyperlink>
     </w:p>
     <w:p>
       <w:pPr>
@@ -260,7 +191,7 @@
         </w:rPr>
         <w:t>– Địa chỉ Website: </w:t>
       </w:r>
-      <w:hyperlink r:id="rId8" w:history="1">
+      <w:hyperlink r:id="rId5" w:history="1">
         <w:r>
           <w:rPr>
             <w:rStyle w:val="Hyperlink"/>
@@ -1814,7 +1745,6 @@
           <w:sz w:val="28"/>
           <w:szCs w:val="28"/>
         </w:rPr>
-        <w:lastRenderedPageBreak/>
         <w:t>* Chú ý:</w:t>
       </w:r>
       <w:r>
@@ -1867,6 +1797,7 @@
           <w:sz w:val="28"/>
           <w:szCs w:val="28"/>
         </w:rPr>
+        <w:lastRenderedPageBreak/>
         <w:t>3.1. Đối tượng tuyển sinh:</w:t>
       </w:r>
     </w:p>
@@ -2129,7 +2060,6 @@
           <w:sz w:val="28"/>
           <w:szCs w:val="28"/>
         </w:rPr>
-        <w:lastRenderedPageBreak/>
         <w:t>– Ngành đào tạo:</w:t>
       </w:r>
       <w:r>
@@ -2170,6 +2100,7 @@
           <w:sz w:val="28"/>
           <w:szCs w:val="28"/>
         </w:rPr>
+        <w:lastRenderedPageBreak/>
         <w:t>– Độ tuổi:</w:t>
       </w:r>
       <w:r>
@@ -2386,16 +2317,7 @@
           <w:sz w:val="28"/>
           <w:szCs w:val="28"/>
         </w:rPr>
-        <w:t xml:space="preserve">– Thí sinh tốt nghiệp đại học loại khá ngành/nhóm ngành Công nghệ thông tin (tốt nghiệp nhóm ngành mã 74802) và có chứng chỉ ngoại ngữ quốc tế tương đương </w:t>
-      </w:r>
-      <w:r>
-        <w:rPr>
-          <w:rFonts w:ascii="Times New Roman" w:hAnsi="Times New Roman" w:cs="Times New Roman"/>
-          <w:sz w:val="28"/>
-          <w:szCs w:val="28"/>
-        </w:rPr>
-        <w:lastRenderedPageBreak/>
-        <w:t>IELTS (Academic) đạt 6.5 trở lên (riêng con đẻ của cán bộ Công an IELTS (Academic) đạt 6.0 trở lên).</w:t>
+        <w:t>– Thí sinh tốt nghiệp đại học loại khá ngành/nhóm ngành Công nghệ thông tin (tốt nghiệp nhóm ngành mã 74802) và có chứng chỉ ngoại ngữ quốc tế tương đương IELTS (Academic) đạt 6.5 trở lên (riêng con đẻ của cán bộ Công an IELTS (Academic) đạt 6.0 trở lên).</w:t>
       </w:r>
     </w:p>
     <w:p>
@@ -2417,6 +2339,7 @@
           <w:sz w:val="28"/>
           <w:szCs w:val="28"/>
         </w:rPr>
+        <w:lastRenderedPageBreak/>
         <w:t>* Lưu ý:</w:t>
       </w:r>
     </w:p>
@@ -2717,7 +2640,6 @@
           <w:sz w:val="28"/>
           <w:szCs w:val="28"/>
         </w:rPr>
-        <w:lastRenderedPageBreak/>
         <w:t>+ BTBCA: điểm bài thi đánh giá của BCA;</w:t>
       </w:r>
     </w:p>
@@ -2766,6 +2688,7 @@
           <w:sz w:val="28"/>
           <w:szCs w:val="28"/>
         </w:rPr>
+        <w:lastRenderedPageBreak/>
         <w:t>ádassssssssssssssssssđ</w:t>
       </w:r>
     </w:p>
@@ -4701,7 +4624,7 @@
         </w:rPr>
         <w:t>– Địa chỉ truy cập phần mềm: </w:t>
       </w:r>
-      <w:hyperlink r:id="rId9" w:history="1">
+      <w:hyperlink r:id="rId6" w:history="1">
         <w:r>
           <w:rPr>
             <w:rStyle w:val="Hyperlink"/>
@@ -4748,7 +4671,7 @@
         </w:rPr>
         <w:t>Học viện CSND đề nghị Công an các đơn vị, địa phương phối hợp thực hiện tốt công tác tuyển sinh đại học chính quy tuyển mới đối với công dân đã có bằng tốt nghiệp trình độ đại học trở lên năm 2024. Trong quá trình thực hiện nếu có vướng mắc, đề nghị liên hệ với Học viện CSND (qua Phòng Quản lý đào tạo và bồi dưỡng nâng cao, điện thoại 0869489929; số fax của Học viện CSND: 0243.8362801 hoặc qua thư điện tử: </w:t>
       </w:r>
-      <w:hyperlink r:id="rId10" w:history="1">
+      <w:hyperlink r:id="rId7" w:history="1">
         <w:r>
           <w:rPr>
             <w:rStyle w:val="Hyperlink"/>

</xml_diff>

<commit_message>
Add social links, visitor counter, fix dates, polish UI
</commit_message>
<xml_diff>
--- a/data/news/01.docx
+++ b/data/news/01.docx
@@ -78,6 +78,24 @@
           <w:szCs w:val="28"/>
         </w:rPr>
         <w:t xml:space="preserve"> của cái HVCS</w:t>
+      </w:r>
+    </w:p>
+    <w:p>
+      <w:pPr>
+        <w:spacing w:after="120" w:line="240" w:lineRule="auto"/>
+        <w:rPr>
+          <w:rFonts w:ascii="Times New Roman" w:hAnsi="Times New Roman" w:cs="Times New Roman"/>
+          <w:sz w:val="28"/>
+          <w:szCs w:val="28"/>
+        </w:rPr>
+      </w:pPr>
+      <w:r>
+        <w:rPr>
+          <w:rFonts w:ascii="Times New Roman" w:hAnsi="Times New Roman" w:cs="Times New Roman"/>
+          <w:sz w:val="28"/>
+          <w:szCs w:val="28"/>
+        </w:rPr>
+        <w:t>#Ngay: 01/03/2026</w:t>
       </w:r>
     </w:p>
     <w:p>
@@ -1775,6 +1793,7 @@
           <w:sz w:val="28"/>
           <w:szCs w:val="28"/>
         </w:rPr>
+        <w:lastRenderedPageBreak/>
         <w:t>3. Về đối tượng, điều kiện dự tuyển</w:t>
       </w:r>
     </w:p>
@@ -1797,7 +1816,6 @@
           <w:sz w:val="28"/>
           <w:szCs w:val="28"/>
         </w:rPr>
-        <w:lastRenderedPageBreak/>
         <w:t>3.1. Đối tượng tuyển sinh:</w:t>
       </w:r>
     </w:p>
@@ -6999,7 +7017,6 @@
   <w:style w:type="character" w:default="1" w:styleId="DefaultParagraphFont">
     <w:name w:val="Default Paragraph Font"/>
     <w:uiPriority w:val="1"/>
-    <w:semiHidden/>
     <w:unhideWhenUsed/>
   </w:style>
   <w:style w:type="table" w:default="1" w:styleId="TableNormal">

</xml_diff>